<commit_message>
Publish sanitized ANGEL SWARM updates
</commit_message>
<xml_diff>
--- a/Documentation/ANGEL-SWARM-ARCHITECTURE.docx
+++ b/Documentation/ANGEL-SWARM-ARCHITECTURE.docx
@@ -32,7 +32,7 @@
           <w:sz w:val="21"/>
           <w:szCs w:val="21"/>
         </w:rPr>
-        <w:t xml:space="preserve">Current as of v6.5, 5 September 2026.</w:t>
+        <w:t xml:space="preserve">Current as of v1.1, 9 September 2026.</w:t>
       </w:r>
       <w:r>
         <w:rPr>
@@ -312,7 +312,7 @@
                 <w:sz w:val="19"/>
                 <w:szCs w:val="19"/>
               </w:rPr>
-              <w:t xml:space="preserve"> — thirteen destinations, four map scales. The standalone analyst console </w:t>
+              <w:t xml:space="preserve"> — fourteen destinations, four map scales. The standalone analyst console </w:t>
             </w:r>
             <w:r>
               <w:rPr>
@@ -673,7 +673,7 @@
                 <w:sz w:val="19"/>
                 <w:szCs w:val="19"/>
               </w:rPr>
-              <w:t xml:space="preserve">118 assertions against the shipped engine</w:t>
+              <w:t xml:space="preserve">190 total checks covering engine and host UI behavior, including 12 standalone RESUPPLY TRACK checks; 189 pass and 1 fail</w:t>
             </w:r>
             <w:r>
               <w:rPr>
@@ -683,7 +683,7 @@
                 <w:sz w:val="19"/>
                 <w:szCs w:val="19"/>
               </w:rPr>
-              <w:t xml:space="preserve">, in the browser, offline, nothing mocked — </w:t>
+              <w:t xml:space="preserve">, in the browser, offline, nothing mocked. RESUPPLY TRACK is </w:t>
             </w:r>
             <w:r>
               <w:rPr>
@@ -693,7 +693,7 @@
                 <w:sz w:val="19"/>
                 <w:szCs w:val="19"/>
               </w:rPr>
-              <w:t xml:space="preserve">118 pass, 0 fail</w:t>
+              <w:t xml:space="preserve">12/12 passing</w:t>
             </w:r>
             <w:r>
               <w:rPr>
@@ -703,7 +703,7 @@
                 <w:sz w:val="19"/>
                 <w:szCs w:val="19"/>
               </w:rPr>
-              <w:t xml:space="preserve">, in well under a second. Re-run against the v6.4 build for this revision</w:t>
+              <w:t xml:space="preserve">; the only failure is the separately tracked pre-existing EUCOM_FJORD directional check</w:t>
             </w:r>
           </w:p>
         </w:tc>
@@ -1421,6 +1421,79 @@
                 <w:szCs w:val="19"/>
               </w:rPr>
               <w:t xml:space="preserve"> New in v6.5. See §0.5</w:t>
+            </w:r>
+          </w:p>
+        </w:tc>
+      </w:tr>
+      <w:tr>
+        <w:trPr>
+          <w:cantSplit/>
+        </w:trPr>
+        <w:tc>
+          <w:tcPr>
+            <w:tcW w:type="dxa" w:w="4032"/>
+            <w:tcBorders>
+              <w:top w:val="single" w:color="DDE3E9" w:sz="2"/>
+              <w:left w:val="none" w:color="FFFFFF" w:sz="0"/>
+              <w:bottom w:val="single" w:color="DDE3E9" w:sz="2"/>
+              <w:right w:val="none" w:color="FFFFFF" w:sz="0"/>
+            </w:tcBorders>
+            <w:shd w:fill="FFFFFF" w:color="auto" w:val="clear"/>
+            <w:tcMar>
+              <w:top w:type="dxa" w:w="90"/>
+              <w:left w:type="dxa" w:w="130"/>
+              <w:bottom w:type="dxa" w:w="90"/>
+              <w:right w:type="dxa" w:w="130"/>
+            </w:tcMar>
+          </w:tcPr>
+          <w:p>
+            <w:pPr>
+              <w:spacing w:after="0" w:before="0"/>
+              <w:jc w:val="left"/>
+            </w:pPr>
+            <w:r>
+              <w:rPr>
+                <w:b/>
+                <w:bCs/>
+                <w:color w:val="1A1A1A"/>
+                <w:sz w:val="19"/>
+                <w:szCs w:val="19"/>
+              </w:rPr>
+              <w:t xml:space="preserve">Resupply Tracking</w:t>
+            </w:r>
+          </w:p>
+        </w:tc>
+        <w:tc>
+          <w:tcPr>
+            <w:tcW w:type="dxa" w:w="6048"/>
+            <w:tcBorders>
+              <w:top w:val="single" w:color="DDE3E9" w:sz="2"/>
+              <w:left w:val="none" w:color="FFFFFF" w:sz="0"/>
+              <w:bottom w:val="single" w:color="DDE3E9" w:sz="2"/>
+              <w:right w:val="none" w:color="FFFFFF" w:sz="0"/>
+            </w:tcBorders>
+            <w:shd w:fill="FFFFFF" w:color="auto" w:val="clear"/>
+            <w:tcMar>
+              <w:top w:type="dxa" w:w="90"/>
+              <w:left w:type="dxa" w:w="130"/>
+              <w:bottom w:type="dxa" w:w="90"/>
+              <w:right w:type="dxa" w:w="130"/>
+            </w:tcMar>
+          </w:tcPr>
+          <w:p>
+            <w:pPr>
+              <w:spacing w:after="0" w:before="0"/>
+              <w:jc w:val="left"/>
+            </w:pPr>
+            <w:r>
+              <w:rPr>
+                <w:b w:val="false"/>
+                <w:bCs w:val="false"/>
+                <w:color w:val="1A1A1A"/>
+                <w:sz w:val="19"/>
+                <w:szCs w:val="19"/>
+              </w:rPr>
+              <w:t xml:space="preserve">A fourteenth destination and standalone synthetic capability demonstration with immutable tracker-only fixtures and controls. It is not a projection of engine state, run snapshots, scenarios, casualties, fleet history or Arm B ledgers. See §0.6</w:t>
             </w:r>
           </w:p>
         </w:tc>
@@ -4221,7 +4294,7 @@
           <w:sz w:val="21"/>
           <w:szCs w:val="21"/>
         </w:rPr>
-        <w:t xml:space="preserve"> the Cursor on Target feed a joint operations area already   produces — it adds a track consumer, not a new interface. `cmd/cotsim` does   emit CoT, but it is a device simulator standing in for fielded monitors so   the ingest path is exercised by a real socket from outside the program; it is   not part of the application and not a device driver. An emit path is the   obvious next step and is </w:t>
+        <w:t xml:space="preserve"> the Cursor on Target feed a joint operations area already   produces — it adds a track consumer, not a new interface. `cmd/cotsim` does   emit CoT, but it is a device simulator standing in for a hypothetical   monitor feed so the ingest path is exercised by a real socket from outside   the program; it is not part of the application and not a device driver. An   emit path is the obvious next step and is </w:t>
       </w:r>
       <w:r>
         <w:rPr>
@@ -4258,7 +4331,7 @@
           <w:sz w:val="21"/>
           <w:szCs w:val="21"/>
         </w:rPr>
-        <w:t xml:space="preserve">The exported health resources are FHIR-shaped, not conformance-tested.</w:t>
+        <w:t xml:space="preserve">The named edge systems have distinct roles, not an integration.</w:t>
       </w:r>
     </w:p>
     <w:p>
@@ -4272,24 +4345,79 @@
           <w:sz w:val="21"/>
           <w:szCs w:val="21"/>
         </w:rPr>
-        <w:t xml:space="preserve">  Every exported resource carries that tag in its own </w:t>
-      </w:r>
-      <w:r>
-        <w:rPr>
-          <w:rFonts w:ascii="Consolas" w:cs="Consolas" w:eastAsia="Consolas" w:hAnsi="Consolas"/>
-          <w:color w:val="1A1A1A"/>
-          <w:sz w:val="19"/>
-          <w:szCs w:val="19"/>
-        </w:rPr>
-        <w:t xml:space="preserve">meta.tag</w:t>
-      </w:r>
-      <w:r>
-        <w:rPr>
-          <w:color w:val="1A1A1A"/>
-          <w:sz w:val="21"/>
-          <w:szCs w:val="21"/>
-        </w:rPr>
-        <w:t xml:space="preserve">. The word   "compliant" is not used in the build or in this record.</w:t>
+        <w:t xml:space="preserve">  </w:t>
+      </w:r>
+      <w:r>
+        <w:rPr>
+          <w:b/>
+          <w:bCs/>
+          <w:color w:val="1A1A1A"/>
+          <w:sz w:val="21"/>
+          <w:szCs w:val="21"/>
+        </w:rPr>
+        <w:t xml:space="preserve">Sempulse Halo (example)</w:t>
+      </w:r>
+      <w:r>
+        <w:rPr>
+          <w:color w:val="1A1A1A"/>
+          <w:sz w:val="21"/>
+          <w:szCs w:val="21"/>
+        </w:rPr>
+        <w:t xml:space="preserve"> is a wearable source; </w:t>
+      </w:r>
+      <w:r>
+        <w:rPr>
+          <w:b/>
+          <w:bCs/>
+          <w:color w:val="1A1A1A"/>
+          <w:sz w:val="21"/>
+          <w:szCs w:val="21"/>
+        </w:rPr>
+        <w:t xml:space="preserve">CipherOx CRI M1   (reference)</w:t>
+      </w:r>
+      <w:r>
+        <w:rPr>
+          <w:color w:val="1A1A1A"/>
+          <w:sz w:val="21"/>
+          <w:szCs w:val="21"/>
+        </w:rPr>
+        <w:t xml:space="preserve"> anchors the compensatory-reserve concept; </w:t>
+      </w:r>
+      <w:r>
+        <w:rPr>
+          <w:b/>
+          <w:bCs/>
+          <w:color w:val="1A1A1A"/>
+          <w:sz w:val="21"/>
+          <w:szCs w:val="21"/>
+        </w:rPr>
+        <w:t xml:space="preserve">BATDOK-J</w:t>
+      </w:r>
+      <w:r>
+        <w:rPr>
+          <w:color w:val="1A1A1A"/>
+          <w:sz w:val="21"/>
+          <w:szCs w:val="21"/>
+        </w:rPr>
+        <w:t xml:space="preserve"> is the   plausible producer/interface. </w:t>
+      </w:r>
+      <w:r>
+        <w:rPr>
+          <w:b/>
+          <w:bCs/>
+          <w:color w:val="1A1A1A"/>
+          <w:sz w:val="21"/>
+          <w:szCs w:val="21"/>
+        </w:rPr>
+        <w:t xml:space="preserve">ANGEL SWARM has not tested an integration   with any real Sempulse Halo, CipherOx CRI M1, or BATDOK-J.</w:t>
+      </w:r>
+      <w:r>
+        <w:rPr>
+          <w:color w:val="1A1A1A"/>
+          <w:sz w:val="21"/>
+          <w:szCs w:val="21"/>
+        </w:rPr>
+        <w:t xml:space="preserve"> No compatibility,   operational use, or completed integration is claimed, and the medical detail   extension exercised here is not a ratified CoT schema.</w:t>
       </w:r>
     </w:p>
     <w:p>
@@ -4308,14 +4436,7 @@
           <w:sz w:val="21"/>
           <w:szCs w:val="21"/>
         </w:rPr>
-        <w:t xml:space="preserve">STANAG 4586 is not implemented.</w:t>
-      </w:r>
-      <w:r>
-        <w:rPr>
-          <w:sz w:val="21"/>
-          <w:szCs w:val="21"/>
-        </w:rPr>
-        <w:t xml:space="preserve"> It is named as the correct target</w:t>
+        <w:t xml:space="preserve">The exported health resources are FHIR-shaped, not conformance-tested.</w:t>
       </w:r>
     </w:p>
     <w:p>
@@ -4329,7 +4450,178 @@
           <w:sz w:val="21"/>
           <w:szCs w:val="21"/>
         </w:rPr>
+        <w:t xml:space="preserve">  Every exported resource carries that tag in its own </w:t>
+      </w:r>
+      <w:r>
+        <w:rPr>
+          <w:rFonts w:ascii="Consolas" w:cs="Consolas" w:eastAsia="Consolas" w:hAnsi="Consolas"/>
+          <w:color w:val="1A1A1A"/>
+          <w:sz w:val="19"/>
+          <w:szCs w:val="19"/>
+        </w:rPr>
+        <w:t xml:space="preserve">meta.tag</w:t>
+      </w:r>
+      <w:r>
+        <w:rPr>
+          <w:color w:val="1A1A1A"/>
+          <w:sz w:val="21"/>
+          <w:szCs w:val="21"/>
+        </w:rPr>
+        <w:t xml:space="preserve">. The word   "compliant" is not used in the build or in this record.</w:t>
+      </w:r>
+    </w:p>
+    <w:p>
+      <w:pPr>
+        <w:pStyle w:val="ListParagraph"/>
+        <w:numPr>
+          <w:ilvl w:val="0"/>
+          <w:numId w:val="2"/>
+        </w:numPr>
+        <w:spacing w:after="50" w:before="50"/>
+      </w:pPr>
+      <w:r>
+        <w:rPr>
+          <w:b/>
+          <w:bCs/>
+          <w:sz w:val="21"/>
+          <w:szCs w:val="21"/>
+        </w:rPr>
+        <w:t xml:space="preserve">STANAG 4586 is not implemented.</w:t>
+      </w:r>
+      <w:r>
+        <w:rPr>
+          <w:sz w:val="21"/>
+          <w:szCs w:val="21"/>
+        </w:rPr>
+        <w:t xml:space="preserve"> It is named as the correct target</w:t>
+      </w:r>
+    </w:p>
+    <w:p>
+      <w:pPr>
+        <w:spacing w:after="140" w:before="60"/>
+        <w:jc w:val="left"/>
+      </w:pPr>
+      <w:r>
+        <w:rPr>
+          <w:color w:val="1A1A1A"/>
+          <w:sz w:val="21"/>
+          <w:szCs w:val="21"/>
+        </w:rPr>
         <w:t xml:space="preserve">  interface and nothing more.</w:t>
+      </w:r>
+    </w:p>
+    <w:p>
+      <w:pPr>
+        <w:pStyle w:val="Heading2"/>
+        <w:spacing w:after="100" w:before="280"/>
+      </w:pPr>
+      <w:r>
+        <w:rPr>
+          <w:rFonts w:ascii="Calibri" w:cs="Calibri" w:eastAsia="Calibri" w:hAnsi="Calibri"/>
+          <w:b/>
+          <w:bCs/>
+          <w:color w:val="3E5C76"/>
+          <w:sz w:val="23"/>
+          <w:szCs w:val="23"/>
+        </w:rPr>
+        <w:t xml:space="preserve">0.6 Resupply Tracking is standalone synthetic demonstration</w:t>
+      </w:r>
+    </w:p>
+    <w:p>
+      <w:pPr>
+        <w:spacing w:after="140" w:before="60"/>
+        <w:jc w:val="left"/>
+      </w:pPr>
+      <w:r>
+        <w:rPr>
+          <w:color w:val="1A1A1A"/>
+          <w:sz w:val="21"/>
+          <w:szCs w:val="21"/>
+        </w:rPr>
+        <w:t xml:space="preserve">Resupply Tracking owns immutable synthetic demo commitments and its own deterministic clock. Its seek, play/pause, tracker-owned normal/8× playback toggle (</w:t>
+      </w:r>
+      <w:r>
+        <w:rPr>
+          <w:rFonts w:ascii="Consolas" w:cs="Consolas" w:eastAsia="Consolas" w:hAnsi="Consolas"/>
+          <w:color w:val="1A1A1A"/>
+          <w:sz w:val="19"/>
+          <w:szCs w:val="19"/>
+        </w:rPr>
+        <w:t xml:space="preserve">SPEED ×8</w:t>
+      </w:r>
+      <w:r>
+        <w:rPr>
+          <w:color w:val="1A1A1A"/>
+          <w:sz w:val="21"/>
+          <w:szCs w:val="21"/>
+        </w:rPr>
+        <w:t xml:space="preserve"> / </w:t>
+      </w:r>
+      <w:r>
+        <w:rPr>
+          <w:rFonts w:ascii="Consolas" w:cs="Consolas" w:eastAsia="Consolas" w:hAnsi="Consolas"/>
+          <w:color w:val="1A1A1A"/>
+          <w:sz w:val="19"/>
+          <w:szCs w:val="19"/>
+        </w:rPr>
+        <w:t xml:space="preserve">SPEED ×1</w:t>
+      </w:r>
+      <w:r>
+        <w:rPr>
+          <w:color w:val="1A1A1A"/>
+          <w:sz w:val="21"/>
+          <w:szCs w:val="21"/>
+        </w:rPr>
+        <w:t xml:space="preserve">), reroute and exception controls drive tracker-only fixtures: nominal phases plus diverted, aborted, lost, deadline-miss, cold-chain-failure and delivered states. Names, times, routes and payloads are synthetic tracker fixtures and cannot be treated as operational output. The margin-sorted queue and Arm B scheduled-push comparison state are also tracker-owned. Nothing is read from or projected over engine tasking, scenarios, casualties, host playback, run snapshots, as-of fleet history or Arm B ledgers, and no model runs on this path. The speed toggle changes only the tracker's deterministic clock, never host playback or engine state. The tracker does not modify engine state or outcomes.</w:t>
+      </w:r>
+    </w:p>
+    <w:p>
+      <w:pPr>
+        <w:spacing w:after="140" w:before="60"/>
+        <w:jc w:val="left"/>
+      </w:pPr>
+      <w:r>
+        <w:rPr>
+          <w:color w:val="1A1A1A"/>
+          <w:sz w:val="21"/>
+          <w:szCs w:val="21"/>
+        </w:rPr>
+        <w:t xml:space="preserve">The destination's schematic is Canvas 2D and local. It creates no deck.gl instance, adds no library, has no network interface and makes no request. </w:t>
+      </w:r>
+      <w:r>
+        <w:rPr>
+          <w:rFonts w:ascii="Consolas" w:cs="Consolas" w:eastAsia="Consolas" w:hAnsi="Consolas"/>
+          <w:color w:val="1A1A1A"/>
+          <w:sz w:val="19"/>
+          <w:szCs w:val="19"/>
+        </w:rPr>
+        <w:t xml:space="preserve">Send to medic's ATAK</w:t>
+      </w:r>
+      <w:r>
+        <w:rPr>
+          <w:color w:val="1A1A1A"/>
+          <w:sz w:val="21"/>
+          <w:szCs w:val="21"/>
+        </w:rPr>
+        <w:t xml:space="preserve"> opens an informational, future-only modal; it emits nothing. No BATDOK-J, ATAK, TAK Server, Marti REST or outbound CoT integration exists. </w:t>
+      </w:r>
+      <w:r>
+        <w:rPr>
+          <w:b/>
+          <w:bCs/>
+          <w:color w:val="1A1A1A"/>
+          <w:sz w:val="21"/>
+          <w:szCs w:val="21"/>
+        </w:rPr>
+        <w:t xml:space="preserve">CoT remains ingest-only</w:t>
+      </w:r>
+      <w:r>
+        <w:rPr>
+          <w:color w:val="1A1A1A"/>
+          <w:sz w:val="21"/>
+          <w:szCs w:val="21"/>
+        </w:rPr>
+        <w:t xml:space="preserve"> for the separate optional telemetry path.</w:t>
       </w:r>
     </w:p>
     <w:p>
@@ -5660,7 +5952,7 @@
           <w:sz w:val="21"/>
           <w:szCs w:val="21"/>
         </w:rPr>
-        <w:t xml:space="preserve">  stands in for fielded monitors so the ingest path is exercised by a real   socket from outside the program. It is </w:t>
+        <w:t xml:space="preserve">  stands in for a hypothetical monitor feed so the ingest path is exercised   by a real socket from outside the program. It is </w:t>
       </w:r>
       <w:r>
         <w:rPr>
@@ -5678,7 +5970,7 @@
           <w:sz w:val="21"/>
           <w:szCs w:val="21"/>
         </w:rPr>
-        <w:t xml:space="preserve"> a device driver and the   medical detail extension it emits is </w:t>
+        <w:t xml:space="preserve"> a device driver and   the medical detail extension it emits is </w:t>
       </w:r>
       <w:r>
         <w:rPr>
@@ -5852,6 +6144,84 @@
       </w:pPr>
       <w:r>
         <w:rPr>
+          <w:rFonts w:ascii="Consolas" w:cs="Consolas" w:eastAsia="Consolas" w:hAnsi="Consolas"/>
+          <w:sz w:val="19"/>
+          <w:szCs w:val="19"/>
+        </w:rPr>
+        <w:t xml:space="preserve">app/js/resupply-track.js</w:t>
+      </w:r>
+      <w:r>
+        <w:rPr>
+          <w:sz w:val="21"/>
+          <w:szCs w:val="21"/>
+        </w:rPr>
+        <w:t xml:space="preserve"> — standalone synthetic resupply-tracking fixtures,</w:t>
+      </w:r>
+    </w:p>
+    <w:p>
+      <w:pPr>
+        <w:spacing w:after="140" w:before="60"/>
+        <w:jc w:val="left"/>
+      </w:pPr>
+      <w:r>
+        <w:rPr>
+          <w:color w:val="1A1A1A"/>
+          <w:sz w:val="21"/>
+          <w:szCs w:val="21"/>
+        </w:rPr>
+        <w:t xml:space="preserve">  deterministic clock, route phase ladder and explicit no-transmission ATAK modal.</w:t>
+      </w:r>
+    </w:p>
+    <w:p>
+      <w:pPr>
+        <w:pStyle w:val="ListParagraph"/>
+        <w:numPr>
+          <w:ilvl w:val="0"/>
+          <w:numId w:val="2"/>
+        </w:numPr>
+        <w:spacing w:after="50" w:before="50"/>
+      </w:pPr>
+      <w:r>
+        <w:rPr>
+          <w:rFonts w:ascii="Consolas" w:cs="Consolas" w:eastAsia="Consolas" w:hAnsi="Consolas"/>
+          <w:sz w:val="19"/>
+          <w:szCs w:val="19"/>
+        </w:rPr>
+        <w:t xml:space="preserve">app/angel-resupply-track.js</w:t>
+      </w:r>
+      <w:r>
+        <w:rPr>
+          <w:sz w:val="21"/>
+          <w:szCs w:val="21"/>
+        </w:rPr>
+        <w:t xml:space="preserve"> — shell adapter that mounts the tracker-only</w:t>
+      </w:r>
+    </w:p>
+    <w:p>
+      <w:pPr>
+        <w:spacing w:after="140" w:before="60"/>
+        <w:jc w:val="left"/>
+      </w:pPr>
+      <w:r>
+        <w:rPr>
+          <w:color w:val="1A1A1A"/>
+          <w:sz w:val="21"/>
+          <w:szCs w:val="21"/>
+        </w:rPr>
+        <w:t xml:space="preserve">  demonstration; it adds no engine or network boundary.</w:t>
+      </w:r>
+    </w:p>
+    <w:p>
+      <w:pPr>
+        <w:pStyle w:val="ListParagraph"/>
+        <w:numPr>
+          <w:ilvl w:val="0"/>
+          <w:numId w:val="2"/>
+        </w:numPr>
+        <w:spacing w:after="50" w:before="50"/>
+      </w:pPr>
+      <w:r>
+        <w:rPr>
           <w:sz w:val="21"/>
           <w:szCs w:val="21"/>
         </w:rPr>
@@ -6100,7 +6470,25 @@
           <w:sz w:val="21"/>
           <w:szCs w:val="21"/>
         </w:rPr>
-        <w:t xml:space="preserve">1-D CNN reading 5 s of photoplethysmogram at 100 Hz, emitting compensatory reserve. Mirrors the operating principle of CipherOx CRM, FDA 510(k) K173929. Trained from scratch; </w:t>
+        <w:t xml:space="preserve">1-D CNN reading 5 s of photoplethysmogram at 100 Hz, emitting compensatory reserve. Uses </w:t>
+      </w:r>
+      <w:r>
+        <w:rPr>
+          <w:b/>
+          <w:bCs/>
+          <w:color w:val="1A1A1A"/>
+          <w:sz w:val="21"/>
+          <w:szCs w:val="21"/>
+        </w:rPr>
+        <w:t xml:space="preserve">CipherOx CRI M1 as the reference device</w:t>
+      </w:r>
+      <w:r>
+        <w:rPr>
+          <w:color w:val="1A1A1A"/>
+          <w:sz w:val="21"/>
+          <w:szCs w:val="21"/>
+        </w:rPr>
+        <w:t xml:space="preserve"> for the compensatory-reserve concept; it is not that device and has not been tested with it. Trained from scratch; </w:t>
       </w:r>
       <w:r>
         <w:rPr>

</xml_diff>